<commit_message>
added extras, additional writings name
</commit_message>
<xml_diff>
--- a/chapters/GTIchap9.docx
+++ b/chapters/GTIchap9.docx
@@ -3,26 +3,6 @@
 <w:document xmlns:mc="http://schemas.openxmlformats.org/markup-compatibility/2006" xmlns:o="urn:schemas-microsoft-com:office:office" xmlns:r="http://schemas.openxmlformats.org/officeDocument/2006/relationships" xmlns:m="http://schemas.openxmlformats.org/officeDocument/2006/math" xmlns:v="urn:schemas-microsoft-com:vml" xmlns:wp="http://schemas.openxmlformats.org/drawingml/2006/wordprocessingDrawing" xmlns:w10="urn:schemas-microsoft-com:office:word" xmlns:w="http://schemas.openxmlformats.org/wordprocessingml/2006/main" xmlns:wne="http://schemas.microsoft.com/office/word/2006/wordml" xmlns:sl="http://schemas.openxmlformats.org/schemaLibrary/2006/main" xmlns:a="http://schemas.openxmlformats.org/drawingml/2006/main" xmlns:pic="http://schemas.openxmlformats.org/drawingml/2006/picture" xmlns:c="http://schemas.openxmlformats.org/drawingml/2006/chart" xmlns:lc="http://schemas.openxmlformats.org/drawingml/2006/lockedCanvas" xmlns:dgm="http://schemas.openxmlformats.org/drawingml/2006/diagram" xmlns:wps="http://schemas.microsoft.com/office/word/2010/wordprocessingShape" xmlns:wpg="http://schemas.microsoft.com/office/word/2010/wordprocessingGroup" xmlns:w14="http://schemas.microsoft.com/office/word/2010/wordml" xmlns:w15="http://schemas.microsoft.com/office/word/2012/wordml" xmlns:w16="http://schemas.microsoft.com/office/word/2018/wordml" xmlns:w16cex="http://schemas.microsoft.com/office/word/2018/wordml/cex" xmlns:w16cid="http://schemas.microsoft.com/office/word/2016/wordml/cid" xmlns="http://schemas.microsoft.com/office/tasks/2019/documenttasks" xmlns:cr="http://schemas.microsoft.com/office/comments/2020/reactions">
   <w:background w:color="434343"/>
   <w:body>
-    <w:p>
-      <w:pPr>
-        <w:rPr>
-          <w:rFonts w:ascii="Montserrat" w:cs="Montserrat" w:eastAsia="Montserrat" w:hAnsi="Montserrat"/>
-          <w:b w:val="1"/>
-          <w:bCs w:val="1"/>
-          <w:color w:val="ffffff"/>
-          <w:sz w:val="48"/>
-          <w:szCs w:val="48"/>
-        </w:rPr>
-      </w:pPr>
-      <w:r>
-        <w:br w:type="page"/>
-      </w:r>
-      <w:r>
-        <w:rPr>
-          <w:rtl w:val="0"/>
-        </w:rPr>
-      </w:r>
-    </w:p>
     <w:p>
       <w:pPr>
         <w:jc w:val="center"/>

</xml_diff>